<commit_message>
Aplica identidade visual do curso ao estudo de caso
</commit_message>
<xml_diff>
--- a/entregas/Estudo_de_Caso_O_Relatorio_Que_Nao_Ficara_Pronto_Versao_Final.docx
+++ b/entregas/Estudo_de_Caso_O_Relatorio_Que_Nao_Ficara_Pronto_Versao_Final.docx
@@ -2,6 +2,176 @@
 <file path=word/document.xml><?xml version="1.0" encoding="utf-8"?>
 <w:document xmlns:wpc="http://schemas.microsoft.com/office/word/2010/wordprocessingCanvas" xmlns:mo="http://schemas.microsoft.com/office/mac/office/2008/main" xmlns:mc="http://schemas.openxmlformats.org/markup-compatibility/2006" xmlns:mv="urn:schemas-microsoft-com:mac:vml" xmlns:o="urn:schemas-microsoft-com:office:office" xmlns:r="http://schemas.openxmlformats.org/officeDocument/2006/relationships" xmlns:m="http://schemas.openxmlformats.org/officeDocument/2006/math" xmlns:v="urn:schemas-microsoft-com:vml" xmlns:wp14="http://schemas.microsoft.com/office/word/2010/wordprocessingDrawing" xmlns:wp="http://schemas.openxmlformats.org/drawingml/2006/wordprocessingDrawing" xmlns:w10="urn:schemas-microsoft-com:office:word" xmlns:w="http://schemas.openxmlformats.org/wordprocessingml/2006/main" xmlns:w14="http://schemas.microsoft.com/office/word/2010/wordml" xmlns:wpg="http://schemas.microsoft.com/office/word/2010/wordprocessingGroup" xmlns:wpi="http://schemas.microsoft.com/office/word/2010/wordprocessingInk" xmlns:wne="http://schemas.microsoft.com/office/word/2006/wordml" xmlns:wps="http://schemas.microsoft.com/office/word/2010/wordprocessingShape" mc:Ignorable="w14 wp14">
   <w:body>
+    <w:p>
+      <w:pPr>
+        <w:jc w:val="center"/>
+      </w:pPr>
+      <w:r>
+        <w:drawing>
+          <wp:inline xmlns:a="http://schemas.openxmlformats.org/drawingml/2006/main" xmlns:pic="http://schemas.openxmlformats.org/drawingml/2006/picture">
+            <wp:extent cx="882000" cy="882000"/>
+            <wp:docPr id="1" name="Picture 1"/>
+            <wp:cNvGraphicFramePr>
+              <a:graphicFrameLocks noChangeAspect="1"/>
+            </wp:cNvGraphicFramePr>
+            <a:graphic>
+              <a:graphicData uri="http://schemas.openxmlformats.org/drawingml/2006/picture">
+                <pic:pic>
+                  <pic:nvPicPr>
+                    <pic:cNvPr id="0" name="logo-cjud.jpg"/>
+                    <pic:cNvPicPr/>
+                  </pic:nvPicPr>
+                  <pic:blipFill>
+                    <a:blip r:embed="rId11"/>
+                    <a:stretch>
+                      <a:fillRect/>
+                    </a:stretch>
+                  </pic:blipFill>
+                  <pic:spPr>
+                    <a:xfrm>
+                      <a:off x="0" y="0"/>
+                      <a:ext cx="882000" cy="882000"/>
+                    </a:xfrm>
+                    <a:prstGeom prst="rect"/>
+                  </pic:spPr>
+                </pic:pic>
+              </a:graphicData>
+            </a:graphic>
+          </wp:inline>
+        </w:drawing>
+      </w:r>
+    </w:p>
+    <w:p>
+      <w:pPr>
+        <w:jc w:val="center"/>
+      </w:pPr>
+      <w:r>
+        <w:rPr>
+          <w:b/>
+          <w:color w:val="17488F"/>
+          <w:sz w:val="22"/>
+        </w:rPr>
+        <w:t>TJRS · FORMAÇÃO DE GESTORES</w:t>
+      </w:r>
+    </w:p>
+    <w:tbl>
+      <w:tblPr>
+        <w:tblW w:type="auto" w:w="0"/>
+        <w:tblLook w:firstColumn="1" w:firstRow="1" w:lastColumn="0" w:lastRow="0" w:noHBand="0" w:noVBand="1" w:val="04A0"/>
+      </w:tblPr>
+      <w:tblGrid>
+        <w:gridCol w:w="9972"/>
+      </w:tblGrid>
+      <w:tr>
+        <w:tc>
+          <w:tcPr>
+            <w:tcW w:type="dxa" w:w="9972"/>
+            <w:shd w:fill="0E2F66"/>
+            <w:tcMar>
+              <w:top w:w="360" w:type="dxa"/>
+              <w:start w:w="420" w:type="dxa"/>
+              <w:bottom w:w="360" w:type="dxa"/>
+              <w:end w:w="420" w:type="dxa"/>
+            </w:tcMar>
+          </w:tcPr>
+          <w:p>
+            <w:pPr>
+              <w:jc w:val="center"/>
+            </w:pPr>
+            <w:r>
+              <w:rPr>
+                <w:rFonts w:ascii="Aptos Display" w:hAnsi="Aptos Display"/>
+                <w:b/>
+                <w:color w:val="FFFFFF"/>
+                <w:sz w:val="48"/>
+              </w:rPr>
+              <w:t>COMUNICAÇÃO ASSERTIVA</w:t>
+            </w:r>
+          </w:p>
+          <w:p>
+            <w:pPr>
+              <w:jc w:val="center"/>
+            </w:pPr>
+            <w:r>
+              <w:rPr>
+                <w:b/>
+                <w:color w:val="DDEAFF"/>
+                <w:sz w:val="28"/>
+              </w:rPr>
+              <w:t>Inteligência Emocional e Comunicação Não Violenta</w:t>
+            </w:r>
+          </w:p>
+        </w:tc>
+      </w:tr>
+    </w:tbl>
+    <w:tbl>
+      <w:tblPr>
+        <w:tblW w:type="auto" w:w="0"/>
+        <w:tblLayout w:type="fixed"/>
+        <w:tblLook w:firstColumn="1" w:firstRow="1" w:lastColumn="0" w:lastRow="0" w:noHBand="0" w:noVBand="1" w:val="04A0"/>
+      </w:tblPr>
+      <w:tblGrid>
+        <w:gridCol w:w="2493"/>
+        <w:gridCol w:w="2493"/>
+        <w:gridCol w:w="2493"/>
+        <w:gridCol w:w="2493"/>
+      </w:tblGrid>
+      <w:tr>
+        <w:tc>
+          <w:tcPr>
+            <w:tcW w:type="dxa" w:w="2493"/>
+            <w:shd w:fill="17488F"/>
+            <w:tcMar>
+              <w:top w:w="45" w:type="dxa"/>
+              <w:start w:w="0" w:type="dxa"/>
+              <w:bottom w:w="45" w:type="dxa"/>
+              <w:end w:w="0" w:type="dxa"/>
+            </w:tcMar>
+          </w:tcPr>
+          <w:p/>
+        </w:tc>
+        <w:tc>
+          <w:tcPr>
+            <w:tcW w:type="dxa" w:w="2493"/>
+            <w:shd w:fill="76B82A"/>
+            <w:tcMar>
+              <w:top w:w="45" w:type="dxa"/>
+              <w:start w:w="0" w:type="dxa"/>
+              <w:bottom w:w="45" w:type="dxa"/>
+              <w:end w:w="0" w:type="dxa"/>
+            </w:tcMar>
+          </w:tcPr>
+          <w:p/>
+        </w:tc>
+        <w:tc>
+          <w:tcPr>
+            <w:tcW w:type="dxa" w:w="2493"/>
+            <w:shd w:fill="F39A24"/>
+            <w:tcMar>
+              <w:top w:w="45" w:type="dxa"/>
+              <w:start w:w="0" w:type="dxa"/>
+              <w:bottom w:w="45" w:type="dxa"/>
+              <w:end w:w="0" w:type="dxa"/>
+            </w:tcMar>
+          </w:tcPr>
+          <w:p/>
+        </w:tc>
+        <w:tc>
+          <w:tcPr>
+            <w:tcW w:type="dxa" w:w="2493"/>
+            <w:shd w:fill="FFD21D"/>
+            <w:tcMar>
+              <w:top w:w="45" w:type="dxa"/>
+              <w:start w:w="0" w:type="dxa"/>
+              <w:bottom w:w="45" w:type="dxa"/>
+              <w:end w:w="0" w:type="dxa"/>
+            </w:tcMar>
+          </w:tcPr>
+          <w:p/>
+        </w:tc>
+      </w:tr>
+    </w:tbl>
+    <w:p/>
     <w:p>
       <w:pPr>
         <w:pStyle w:val="Title"/>
@@ -21,11 +191,75 @@
       <w:r>
         <w:rPr>
           <w:i/>
-          <w:color w:val="506B75"/>
+          <w:color w:val="617087"/>
         </w:rPr>
         <w:t>Estudo de caso em duas partes | Inteligência emocional aplicada à gestão</w:t>
       </w:r>
     </w:p>
+    <w:tbl>
+      <w:tblPr>
+        <w:tblW w:type="auto" w:w="0"/>
+        <w:tblLayout w:type="autofit"/>
+        <w:tblLook w:firstColumn="1" w:firstRow="1" w:lastColumn="0" w:lastRow="0" w:noHBand="0" w:noVBand="1" w:val="04A0"/>
+      </w:tblPr>
+      <w:tblGrid>
+        <w:gridCol w:w="9972"/>
+      </w:tblGrid>
+      <w:tr>
+        <w:tc>
+          <w:tcPr>
+            <w:tcW w:type="dxa" w:w="9972"/>
+            <w:shd w:fill="F4F8FC"/>
+            <w:tcMar>
+              <w:top w:w="150" w:type="dxa"/>
+              <w:start w:w="240" w:type="dxa"/>
+              <w:bottom w:w="150" w:type="dxa"/>
+              <w:end w:w="240" w:type="dxa"/>
+            </w:tcMar>
+          </w:tcPr>
+          <w:p>
+            <w:pPr>
+              <w:jc w:val="center"/>
+            </w:pPr>
+            <w:r>
+              <w:rPr>
+                <w:b/>
+                <w:color w:val="76B82A"/>
+                <w:sz w:val="18"/>
+              </w:rPr>
+              <w:t>FORMADORES</w:t>
+            </w:r>
+          </w:p>
+        </w:tc>
+      </w:tr>
+      <w:tr>
+        <w:tc>
+          <w:tcPr>
+            <w:tcW w:type="dxa" w:w="9972"/>
+            <w:shd w:fill="FFFFFF"/>
+            <w:tcMar>
+              <w:top w:w="150" w:type="dxa"/>
+              <w:start w:w="240" w:type="dxa"/>
+              <w:bottom w:w="150" w:type="dxa"/>
+              <w:end w:w="240" w:type="dxa"/>
+            </w:tcMar>
+          </w:tcPr>
+          <w:p>
+            <w:pPr>
+              <w:jc w:val="center"/>
+            </w:pPr>
+            <w:r>
+              <w:rPr>
+                <w:b/>
+                <w:color w:val="0E2F66"/>
+                <w:sz w:val="23"/>
+              </w:rPr>
+              <w:t>Ânderson Porto  •  Fernando de Assis Alves</w:t>
+            </w:r>
+          </w:p>
+        </w:tc>
+      </w:tr>
+    </w:tbl>
     <w:p>
       <w:pPr>
         <w:jc w:val="center"/>
@@ -33,12 +267,17 @@
       <w:r>
         <w:rPr>
           <w:b/>
-          <w:sz w:val="20"/>
+          <w:color w:val="617087"/>
+          <w:sz w:val="19"/>
         </w:rPr>
         <w:t>Caso fictício para uso formativo. Leia apenas a parte indicada pelo facilitador.</w:t>
       </w:r>
     </w:p>
-    <w:p/>
+    <w:p>
+      <w:r>
+        <w:br w:type="page"/>
+      </w:r>
+    </w:p>
     <w:p>
       <w:pPr>
         <w:pStyle w:val="Heading1"/>
@@ -139,7 +378,7 @@
         <w:tc>
           <w:tcPr>
             <w:tcW w:type="dxa" w:w="9972"/>
-            <w:shd w:fill="1F4E5F"/>
+            <w:shd w:fill="0E2F66"/>
             <w:tcMar>
               <w:top w:w="120" w:type="dxa"/>
               <w:start w:w="160" w:type="dxa"/>
@@ -166,7 +405,7 @@
         <w:tc>
           <w:tcPr>
             <w:tcW w:type="dxa" w:w="9972"/>
-            <w:shd w:fill="EAF2F4"/>
+            <w:shd w:fill="FFF8ED"/>
             <w:tcMar>
               <w:top w:w="120" w:type="dxa"/>
               <w:start w:w="160" w:type="dxa"/>
@@ -225,7 +464,7 @@
         <w:tc>
           <w:tcPr>
             <w:tcW w:type="dxa" w:w="4986"/>
-            <w:shd w:fill="1F4E5F"/>
+            <w:shd w:fill="0E2F66"/>
             <w:vAlign w:val="center"/>
           </w:tcPr>
           <w:p>
@@ -241,7 +480,7 @@
         <w:tc>
           <w:tcPr>
             <w:tcW w:type="dxa" w:w="4986"/>
-            <w:shd w:fill="1F4E5F"/>
+            <w:shd w:fill="0E2F66"/>
             <w:vAlign w:val="center"/>
           </w:tcPr>
           <w:p>
@@ -266,9 +505,14 @@
               <w:end w:w="160" w:type="dxa"/>
             </w:tcMar>
             <w:vAlign w:val="top"/>
+            <w:shd w:fill="F4F8FC"/>
           </w:tcPr>
           <w:p>
             <w:r>
+              <w:rPr>
+                <w:b/>
+                <w:color w:val="15243A"/>
+              </w:rPr>
               <w:t>1. O que pode ser observado? Quais fatos uma câmera, uma gravação ou um registro documental poderia confirmar?</w:t>
             </w:r>
           </w:p>
@@ -283,6 +527,7 @@
               <w:end w:w="160" w:type="dxa"/>
             </w:tcMar>
             <w:vAlign w:val="top"/>
+            <w:shd w:fill="F4F8FC"/>
           </w:tcPr>
           <w:p>
             <w:r>
@@ -307,6 +552,10 @@
           </w:tcPr>
           <w:p>
             <w:r>
+              <w:rPr>
+                <w:b/>
+                <w:color w:val="15243A"/>
+              </w:rPr>
               <w:t>2. O que foi interpretado? Quais avaliações, generalizações, suposições ou conclusões aparecem como se fossem fatos?</w:t>
             </w:r>
           </w:p>
@@ -342,9 +591,14 @@
               <w:end w:w="160" w:type="dxa"/>
             </w:tcMar>
             <w:vAlign w:val="top"/>
+            <w:shd w:fill="F4F8FC"/>
           </w:tcPr>
           <w:p>
             <w:r>
+              <w:rPr>
+                <w:b/>
+                <w:color w:val="15243A"/>
+              </w:rPr>
               <w:t>3. Quais necessidades parecem estar mobilizadas no gestor e no servidor? Que emoções podem emergir quando essas necessidades são atendidas, frustradas ou percebidas como ameaçadas?</w:t>
             </w:r>
           </w:p>
@@ -359,6 +613,7 @@
               <w:end w:w="160" w:type="dxa"/>
             </w:tcMar>
             <w:vAlign w:val="top"/>
+            <w:shd w:fill="F4F8FC"/>
           </w:tcPr>
           <w:p>
             <w:r>
@@ -472,7 +727,7 @@
         <w:tc>
           <w:tcPr>
             <w:tcW w:type="dxa" w:w="4986"/>
-            <w:shd w:fill="1F4E5F"/>
+            <w:shd w:fill="0E2F66"/>
             <w:vAlign w:val="center"/>
           </w:tcPr>
           <w:p>
@@ -488,7 +743,7 @@
         <w:tc>
           <w:tcPr>
             <w:tcW w:type="dxa" w:w="4986"/>
-            <w:shd w:fill="1F4E5F"/>
+            <w:shd w:fill="0E2F66"/>
             <w:vAlign w:val="center"/>
           </w:tcPr>
           <w:p>
@@ -513,9 +768,14 @@
               <w:end w:w="160" w:type="dxa"/>
             </w:tcMar>
             <w:vAlign w:val="top"/>
+            <w:shd w:fill="F4F8FC"/>
           </w:tcPr>
           <w:p>
             <w:r>
+              <w:rPr>
+                <w:b/>
+                <w:color w:val="15243A"/>
+              </w:rPr>
               <w:t>1. Que mudanças corporais o servidor percebeu? Como a interocepção poderia ajudá-lo a reconhecer o próprio estado antes de agir?</w:t>
             </w:r>
           </w:p>
@@ -530,6 +790,7 @@
               <w:end w:w="160" w:type="dxa"/>
             </w:tcMar>
             <w:vAlign w:val="top"/>
+            <w:shd w:fill="F4F8FC"/>
           </w:tcPr>
           <w:p>
             <w:r>
@@ -554,6 +815,10 @@
           </w:tcPr>
           <w:p>
             <w:r>
+              <w:rPr>
+                <w:b/>
+                <w:color w:val="15243A"/>
+              </w:rPr>
               <w:t>2. Como valência e ativação variaram entre a fala do gestor, o trabalho após a cena, o trajeto e a chegada em casa?</w:t>
             </w:r>
           </w:p>
@@ -589,9 +854,14 @@
               <w:end w:w="160" w:type="dxa"/>
             </w:tcMar>
             <w:vAlign w:val="top"/>
+            <w:shd w:fill="F4F8FC"/>
           </w:tcPr>
           <w:p>
             <w:r>
+              <w:rPr>
+                <w:b/>
+                <w:color w:val="15243A"/>
+              </w:rPr>
               <w:t>3. Quais emoções, pensamentos e impulsos podem ser distinguidos? Quais deles são fatos e quais são interpretações ou hipóteses?</w:t>
             </w:r>
           </w:p>
@@ -606,6 +876,7 @@
               <w:end w:w="160" w:type="dxa"/>
             </w:tcMar>
             <w:vAlign w:val="top"/>
+            <w:shd w:fill="F4F8FC"/>
           </w:tcPr>
           <w:p>
             <w:r>
@@ -630,6 +901,10 @@
           </w:tcPr>
           <w:p>
             <w:r>
+              <w:rPr>
+                <w:b/>
+                <w:color w:val="15243A"/>
+              </w:rPr>
               <w:t>4. Onde aparecem ruminação, transferência de ativação e transbordamento emocional?</w:t>
             </w:r>
           </w:p>
@@ -665,9 +940,14 @@
               <w:end w:w="160" w:type="dxa"/>
             </w:tcMar>
             <w:vAlign w:val="top"/>
+            <w:shd w:fill="F4F8FC"/>
           </w:tcPr>
           <w:p>
             <w:r>
+              <w:rPr>
+                <w:b/>
+                <w:color w:val="15243A"/>
+              </w:rPr>
               <w:t>5. Que respostas poderiam preservar, ao mesmo tempo, a responsabilidade pela entrega, a dignidade das pessoas e a qualidade da relação de trabalho?</w:t>
             </w:r>
           </w:p>
@@ -682,6 +962,7 @@
               <w:end w:w="160" w:type="dxa"/>
             </w:tcMar>
             <w:vAlign w:val="top"/>
+            <w:shd w:fill="F4F8FC"/>
           </w:tcPr>
           <w:p>
             <w:r>
@@ -719,7 +1000,7 @@
         <w:tc>
           <w:tcPr>
             <w:tcW w:type="dxa" w:w="4986"/>
-            <w:shd w:fill="1F4E5F"/>
+            <w:shd w:fill="0E2F66"/>
           </w:tcPr>
           <w:p>
             <w:r>
@@ -734,7 +1015,7 @@
         <w:tc>
           <w:tcPr>
             <w:tcW w:type="dxa" w:w="4986"/>
-            <w:shd w:fill="1F4E5F"/>
+            <w:shd w:fill="0E2F66"/>
           </w:tcPr>
           <w:p>
             <w:r>
@@ -905,10 +1186,12 @@
       </w:tr>
     </w:tbl>
     <w:sectPr>
-      <w:footerReference w:type="default" r:id="rId9"/>
+      <w:headerReference w:type="default" r:id="rId9"/>
+      <w:footerReference w:type="default" r:id="rId10"/>
       <w:pgSz w:w="12240" w:h="15840"/>
-      <w:pgMar w:top="1020" w:right="1134" w:bottom="964" w:left="1134" w:header="720" w:footer="720" w:gutter="0"/>
+      <w:pgMar w:top="1020" w:right="1134" w:bottom="964" w:left="1134" w:header="369" w:footer="369" w:gutter="0"/>
       <w:cols w:space="720"/>
+      <w:titlePg/>
       <w:docGrid w:linePitch="360"/>
     </w:sectPr>
   </w:body>
@@ -924,13 +1207,111 @@
     </w:pPr>
     <w:r>
       <w:rPr>
-        <w:color w:val="6A7D84"/>
+        <w:color w:val="617087"/>
         <w:sz w:val="16"/>
       </w:rPr>
-      <w:t>Comunicação Assertiva | Formação de gestores | TJRS</w:t>
+      <w:t xml:space="preserve">Ânderson Porto e Fernando de Assis Alves   •   </w:t>
+    </w:r>
+    <w:r>
+      <w:fldChar w:fldCharType="begin"/>
+      <w:instrText xml:space="preserve"> PAGE </w:instrText>
+      <w:fldChar w:fldCharType="end"/>
     </w:r>
   </w:p>
 </w:ftr>
+</file>
+
+<file path=word/header1.xml><?xml version="1.0" encoding="utf-8"?>
+<w:hdr xmlns:m="http://schemas.openxmlformats.org/officeDocument/2006/math" xmlns:mc="http://schemas.openxmlformats.org/markup-compatibility/2006" xmlns:mo="http://schemas.microsoft.com/office/mac/office/2008/main" xmlns:mv="urn:schemas-microsoft-com:mac:vml" xmlns:o="urn:schemas-microsoft-com:office:office" xmlns:r="http://schemas.openxmlformats.org/officeDocument/2006/relationships" xmlns:v="urn:schemas-microsoft-com:vml" xmlns:w10="urn:schemas-microsoft-com:office:word" xmlns:w14="http://schemas.microsoft.com/office/word/2010/wordml" xmlns:w="http://schemas.openxmlformats.org/wordprocessingml/2006/main" xmlns:wne="http://schemas.microsoft.com/office/word/2006/wordml" xmlns:wp14="http://schemas.microsoft.com/office/word/2010/wordprocessingDrawing" xmlns:wp="http://schemas.openxmlformats.org/drawingml/2006/wordprocessingDrawing" xmlns:wpc="http://schemas.microsoft.com/office/word/2010/wordprocessingCanvas" xmlns:wpg="http://schemas.microsoft.com/office/word/2010/wordprocessingGroup" xmlns:wpi="http://schemas.microsoft.com/office/word/2010/wordprocessingInk" xmlns:wps="http://schemas.microsoft.com/office/word/2010/wordprocessingShape" mc:Ignorable="w14 wp14">
+  <w:p>
+    <w:pPr>
+      <w:pStyle w:val="Header"/>
+    </w:pPr>
+  </w:p>
+  <w:tbl>
+    <w:tblPr>
+      <w:tblW w:type="auto" w:w="0"/>
+      <w:tblLook w:firstColumn="1" w:firstRow="1" w:lastColumn="0" w:lastRow="0" w:noHBand="0" w:noVBand="1" w:val="04A0"/>
+    </w:tblPr>
+    <w:tblGrid>
+      <w:gridCol w:w="709"/>
+      <w:gridCol w:w="8816"/>
+    </w:tblGrid>
+    <w:tr>
+      <w:tc>
+        <w:tcPr>
+          <w:tcW w:type="dxa" w:w="4762"/>
+        </w:tcPr>
+        <w:p>
+          <w:r>
+            <w:drawing>
+              <wp:inline xmlns:a="http://schemas.openxmlformats.org/drawingml/2006/main" xmlns:pic="http://schemas.openxmlformats.org/drawingml/2006/picture">
+                <wp:extent cx="259200" cy="259200"/>
+                <wp:docPr id="1" name="Picture 1"/>
+                <wp:cNvGraphicFramePr>
+                  <a:graphicFrameLocks noChangeAspect="1"/>
+                </wp:cNvGraphicFramePr>
+                <a:graphic>
+                  <a:graphicData uri="http://schemas.openxmlformats.org/drawingml/2006/picture">
+                    <pic:pic>
+                      <pic:nvPicPr>
+                        <pic:cNvPr id="0" name="logo-cjud.jpg"/>
+                        <pic:cNvPicPr/>
+                      </pic:nvPicPr>
+                      <pic:blipFill>
+                        <a:blip r:embed="rId1"/>
+                        <a:stretch>
+                          <a:fillRect/>
+                        </a:stretch>
+                      </pic:blipFill>
+                      <pic:spPr>
+                        <a:xfrm>
+                          <a:off x="0" y="0"/>
+                          <a:ext cx="259200" cy="259200"/>
+                        </a:xfrm>
+                        <a:prstGeom prst="rect"/>
+                      </pic:spPr>
+                    </pic:pic>
+                  </a:graphicData>
+                </a:graphic>
+              </wp:inline>
+            </w:drawing>
+          </w:r>
+        </w:p>
+      </w:tc>
+      <w:tc>
+        <w:tcPr>
+          <w:tcW w:type="dxa" w:w="4762"/>
+        </w:tcPr>
+        <w:p>
+          <w:pPr>
+            <w:jc w:val="right"/>
+          </w:pPr>
+          <w:r>
+            <w:rPr>
+              <w:b/>
+              <w:color w:val="17488F"/>
+              <w:sz w:val="17"/>
+            </w:rPr>
+            <w:t>COMUNICAÇÃO ASSERTIVA · TJRS</w:t>
+          </w:r>
+        </w:p>
+        <w:p>
+          <w:pPr>
+            <w:jc w:val="right"/>
+          </w:pPr>
+          <w:r>
+            <w:rPr>
+              <w:color w:val="617087"/>
+              <w:sz w:val="15"/>
+            </w:rPr>
+            <w:t>Inteligência Emocional e Comunicação Não Violenta</w:t>
+          </w:r>
+        </w:p>
+      </w:tc>
+    </w:tr>
+  </w:tbl>
+</w:hdr>
 </file>
 
 <file path=word/numbering.xml><?xml version="1.0" encoding="utf-8"?>
@@ -1363,7 +1744,7 @@
       <w:rFonts w:asciiTheme="majorHAnsi" w:eastAsiaTheme="majorEastAsia" w:hAnsiTheme="majorHAnsi" w:cstheme="majorBidi" w:ascii="Aptos Display" w:hAnsi="Aptos Display" w:eastAsia="Aptos Display"/>
       <w:b/>
       <w:bCs/>
-      <w:color w:val="173B48"/>
+      <w:color w:val="17488F"/>
       <w:sz w:val="34"/>
       <w:szCs w:val="28"/>
     </w:rPr>
@@ -1387,7 +1768,7 @@
       <w:rFonts w:asciiTheme="majorHAnsi" w:eastAsiaTheme="majorEastAsia" w:hAnsiTheme="majorHAnsi" w:cstheme="majorBidi" w:ascii="Aptos Display" w:hAnsi="Aptos Display" w:eastAsia="Aptos Display"/>
       <w:b/>
       <w:bCs/>
-      <w:color w:val="B45F3A"/>
+      <w:color w:val="F39A24"/>
       <w:sz w:val="26"/>
       <w:szCs w:val="26"/>
     </w:rPr>
@@ -1650,7 +2031,7 @@
     </w:pPr>
     <w:rPr>
       <w:rFonts w:asciiTheme="majorHAnsi" w:eastAsiaTheme="majorEastAsia" w:hAnsiTheme="majorHAnsi" w:cstheme="majorBidi" w:ascii="Aptos Display" w:hAnsi="Aptos Display" w:eastAsia="Aptos Display"/>
-      <w:color w:val="173B48"/>
+      <w:color w:val="0E2F66"/>
       <w:spacing w:val="5"/>
       <w:kern w:val="28"/>
       <w:sz w:val="48"/>

</xml_diff>